<commit_message>
Use minified CSS and add FrontOffice assets
Switch header to load /assets/css/app.min.css instead of the unminified file and add the generated app.min.css. Add frontend build config and dependencies (package.json, package-lock.json, postcss.config.js) to support CSS processing/minification. Also include updated technical docs (doc/doc_tech_Iran.docx plus added PDF and Excel) and several uploads_public cached image assets.
</commit_message>
<xml_diff>
--- a/doc/doc_tech_Iran.docx
+++ b/doc/doc_tech_Iran.docx
@@ -568,14 +568,14 @@
     </w:p>
     <w:p>
       <w:pPr>
+        <w:pStyle w:val="ListParagraph"/>
         <w:numPr>
           <w:ilvl w:val="0"/>
-          <w:numId w:val="5"/>
+          <w:numId w:val="26"/>
         </w:numPr>
         <w:spacing w:before="100" w:beforeAutospacing="1" w:after="100" w:afterAutospacing="1" w:line="240" w:lineRule="auto"/>
         <w:rPr>
           <w:rFonts w:ascii="Arial" w:eastAsia="Times New Roman" w:hAnsi="Arial" w:cs="Arial"/>
-          <w:lang w:val="fr-FR"/>
         </w:rPr>
       </w:pPr>
       <w:hyperlink r:id="rId7" w:history="1">
@@ -583,9 +583,8 @@
           <w:rPr>
             <w:rStyle w:val="Hyperlink"/>
             <w:rFonts w:ascii="Arial" w:eastAsia="Times New Roman" w:hAnsi="Arial" w:cs="Arial"/>
-            <w:lang w:val="fr-FR"/>
           </w:rPr>
-          <w:t>À compléter - Google Sheet de suivi des tâches</w:t>
+          <w:t>https://docs.google.com/spreadsheets/d/1tymznIFXSgyz0a0nYVEAoCar7rfhVpr8/edit?usp=drive_link&amp;ouid=108733788341693393570&amp;rtpof=true&amp;sd=true</w:t>
         </w:r>
       </w:hyperlink>
     </w:p>
@@ -687,15 +686,6 @@
     </w:p>
     <w:p>
       <w:pPr>
-        <w:spacing w:before="100" w:beforeAutospacing="1" w:after="100" w:afterAutospacing="1" w:line="240" w:lineRule="auto"/>
-        <w:rPr>
-          <w:rFonts w:ascii="Arial" w:eastAsia="Times New Roman" w:hAnsi="Arial" w:cs="Arial"/>
-          <w:lang w:val="fr-FR"/>
-        </w:rPr>
-      </w:pPr>
-    </w:p>
-    <w:p>
-      <w:pPr>
         <w:pStyle w:val="Heading2"/>
         <w:rPr>
           <w:rFonts w:ascii="Arial" w:eastAsia="Times New Roman" w:hAnsi="Arial" w:cs="Arial"/>
@@ -752,6 +742,7 @@
       <w:r>
         <w:rPr>
           <w:rFonts w:ascii="Arial" w:hAnsi="Arial" w:cs="Arial"/>
+          <w:noProof/>
         </w:rPr>
         <w:drawing>
           <wp:inline distT="0" distB="0" distL="0" distR="0" wp14:anchorId="64C1A361" wp14:editId="0F5BB42C">
@@ -896,6 +887,7 @@
       <w:r>
         <w:rPr>
           <w:rFonts w:ascii="Arial" w:hAnsi="Arial" w:cs="Arial"/>
+          <w:noProof/>
           <w:lang w:val="fr-FR"/>
         </w:rPr>
         <w:drawing>
@@ -1031,6 +1023,7 @@
       <w:r>
         <w:rPr>
           <w:rFonts w:ascii="Arial" w:hAnsi="Arial" w:cs="Arial"/>
+          <w:noProof/>
         </w:rPr>
         <w:drawing>
           <wp:inline distT="0" distB="0" distL="0" distR="0" wp14:anchorId="1886A79C" wp14:editId="64F42E0E">
@@ -1181,6 +1174,7 @@
       <w:r>
         <w:rPr>
           <w:rFonts w:ascii="Arial" w:hAnsi="Arial" w:cs="Arial"/>
+          <w:noProof/>
         </w:rPr>
         <w:drawing>
           <wp:inline distT="0" distB="0" distL="0" distR="0" wp14:anchorId="48886006" wp14:editId="5D8CE95E">
@@ -1314,6 +1308,7 @@
       <w:r>
         <w:rPr>
           <w:rFonts w:ascii="Arial" w:hAnsi="Arial" w:cs="Arial"/>
+          <w:noProof/>
         </w:rPr>
         <w:drawing>
           <wp:inline distT="0" distB="0" distL="0" distR="0" wp14:anchorId="6AEBCF55" wp14:editId="5F3E2906">
@@ -1363,6 +1358,7 @@
       <w:r>
         <w:rPr>
           <w:rFonts w:ascii="Arial" w:hAnsi="Arial" w:cs="Arial"/>
+          <w:noProof/>
         </w:rPr>
         <w:drawing>
           <wp:inline distT="0" distB="0" distL="0" distR="0" wp14:anchorId="79BD60D9" wp14:editId="36FEEBF3">
@@ -1492,6 +1488,7 @@
       <w:r>
         <w:rPr>
           <w:rFonts w:ascii="Arial" w:hAnsi="Arial" w:cs="Arial"/>
+          <w:noProof/>
         </w:rPr>
         <w:drawing>
           <wp:inline distT="0" distB="0" distL="0" distR="0" wp14:anchorId="7B1CC869" wp14:editId="0D4A32D3">
@@ -1532,6 +1529,7 @@
       <w:r>
         <w:rPr>
           <w:rFonts w:ascii="Arial" w:hAnsi="Arial" w:cs="Arial"/>
+          <w:noProof/>
         </w:rPr>
         <w:drawing>
           <wp:inline distT="0" distB="0" distL="0" distR="0" wp14:anchorId="3BD75A50" wp14:editId="23F11032">
@@ -1572,6 +1570,7 @@
       <w:r>
         <w:rPr>
           <w:rFonts w:ascii="Arial" w:hAnsi="Arial" w:cs="Arial"/>
+          <w:noProof/>
         </w:rPr>
         <w:drawing>
           <wp:inline distT="0" distB="0" distL="0" distR="0" wp14:anchorId="7B26B0FD" wp14:editId="2B6AB1A2">
@@ -1898,6 +1897,7 @@
       <w:r>
         <w:rPr>
           <w:rFonts w:ascii="Arial" w:hAnsi="Arial" w:cs="Arial"/>
+          <w:noProof/>
         </w:rPr>
         <w:drawing>
           <wp:inline distT="0" distB="0" distL="0" distR="0" wp14:anchorId="2B588412" wp14:editId="41A9FA11">
@@ -2050,6 +2050,7 @@
       <w:r>
         <w:rPr>
           <w:rFonts w:ascii="Arial" w:hAnsi="Arial" w:cs="Arial"/>
+          <w:noProof/>
         </w:rPr>
         <w:drawing>
           <wp:inline distT="0" distB="0" distL="0" distR="0" wp14:anchorId="5CC797F3" wp14:editId="0CB6BBE1">
@@ -2212,6 +2213,7 @@
       <w:r>
         <w:rPr>
           <w:rFonts w:ascii="Arial" w:hAnsi="Arial" w:cs="Arial"/>
+          <w:noProof/>
         </w:rPr>
         <w:drawing>
           <wp:inline distT="0" distB="0" distL="0" distR="0" wp14:anchorId="38A97A28" wp14:editId="6CEAFF99">
@@ -2386,6 +2388,7 @@
       <w:r>
         <w:rPr>
           <w:rFonts w:ascii="Arial" w:hAnsi="Arial" w:cs="Arial"/>
+          <w:noProof/>
         </w:rPr>
         <w:drawing>
           <wp:inline distT="0" distB="0" distL="0" distR="0" wp14:anchorId="08499319" wp14:editId="1F2E1C84">
@@ -2435,6 +2438,7 @@
       <w:r>
         <w:rPr>
           <w:rFonts w:ascii="Arial" w:hAnsi="Arial" w:cs="Arial"/>
+          <w:noProof/>
         </w:rPr>
         <w:drawing>
           <wp:inline distT="0" distB="0" distL="0" distR="0" wp14:anchorId="542365A6" wp14:editId="49CBA093">
@@ -2633,6 +2637,7 @@
       <w:r>
         <w:rPr>
           <w:rFonts w:ascii="Arial" w:hAnsi="Arial" w:cs="Arial"/>
+          <w:noProof/>
           <w:lang w:val="fr-FR"/>
         </w:rPr>
         <w:drawing>
@@ -2802,6 +2807,7 @@
       <w:r>
         <w:rPr>
           <w:rFonts w:ascii="Arial" w:hAnsi="Arial" w:cs="Arial"/>
+          <w:noProof/>
         </w:rPr>
         <w:lastRenderedPageBreak/>
         <w:drawing>
@@ -3687,6 +3693,7 @@
         <w:pStyle w:val="Heading2"/>
         <w:rPr>
           <w:rFonts w:ascii="Arial" w:eastAsia="Times New Roman" w:hAnsi="Arial" w:cs="Arial"/>
+          <w:lang w:val="fr-FR"/>
         </w:rPr>
       </w:pPr>
     </w:p>
@@ -3695,6 +3702,7 @@
         <w:pStyle w:val="Heading2"/>
         <w:rPr>
           <w:rFonts w:ascii="Arial" w:eastAsia="Times New Roman" w:hAnsi="Arial" w:cs="Arial"/>
+          <w:lang w:val="fr-FR"/>
         </w:rPr>
       </w:pPr>
     </w:p>
@@ -3703,6 +3711,7 @@
         <w:pStyle w:val="Heading2"/>
         <w:rPr>
           <w:rFonts w:ascii="Arial" w:eastAsia="Times New Roman" w:hAnsi="Arial" w:cs="Arial"/>
+          <w:lang w:val="fr-FR"/>
         </w:rPr>
       </w:pPr>
     </w:p>
@@ -3711,6 +3720,7 @@
         <w:pStyle w:val="Heading2"/>
         <w:rPr>
           <w:rFonts w:ascii="Arial" w:eastAsia="Times New Roman" w:hAnsi="Arial" w:cs="Arial"/>
+          <w:lang w:val="fr-FR"/>
         </w:rPr>
       </w:pPr>
     </w:p>
@@ -3719,6 +3729,7 @@
         <w:pStyle w:val="Heading2"/>
         <w:rPr>
           <w:rFonts w:ascii="Arial" w:eastAsia="Times New Roman" w:hAnsi="Arial" w:cs="Arial"/>
+          <w:lang w:val="fr-FR"/>
         </w:rPr>
       </w:pPr>
     </w:p>
@@ -3727,6 +3738,7 @@
         <w:pStyle w:val="Heading2"/>
         <w:rPr>
           <w:rFonts w:ascii="Arial" w:eastAsia="Times New Roman" w:hAnsi="Arial" w:cs="Arial"/>
+          <w:lang w:val="fr-FR"/>
         </w:rPr>
       </w:pPr>
     </w:p>
@@ -3735,6 +3747,7 @@
         <w:pStyle w:val="Heading2"/>
         <w:rPr>
           <w:rFonts w:ascii="Arial" w:eastAsia="Times New Roman" w:hAnsi="Arial" w:cs="Arial"/>
+          <w:lang w:val="fr-FR"/>
         </w:rPr>
       </w:pPr>
     </w:p>
@@ -3743,6 +3756,7 @@
         <w:pStyle w:val="Heading2"/>
         <w:rPr>
           <w:rFonts w:ascii="Arial" w:eastAsia="Times New Roman" w:hAnsi="Arial" w:cs="Arial"/>
+          <w:lang w:val="fr-FR"/>
         </w:rPr>
       </w:pPr>
     </w:p>
@@ -3751,6 +3765,7 @@
         <w:pStyle w:val="Heading2"/>
         <w:rPr>
           <w:rFonts w:ascii="Arial" w:eastAsia="Times New Roman" w:hAnsi="Arial" w:cs="Arial"/>
+          <w:lang w:val="fr-FR"/>
         </w:rPr>
       </w:pPr>
     </w:p>
@@ -3759,6 +3774,7 @@
         <w:pStyle w:val="Heading2"/>
         <w:rPr>
           <w:rFonts w:ascii="Arial" w:eastAsia="Times New Roman" w:hAnsi="Arial" w:cs="Arial"/>
+          <w:lang w:val="fr-FR"/>
         </w:rPr>
       </w:pPr>
     </w:p>
@@ -5842,6 +5858,119 @@
     </w:lvl>
   </w:abstractNum>
   <w:abstractNum w:abstractNumId="9" w15:restartNumberingAfterBreak="0">
+    <w:nsid w:val="3BFD10AC"/>
+    <w:multiLevelType w:val="hybridMultilevel"/>
+    <w:tmpl w:val="6F98B166"/>
+    <w:lvl w:ilvl="0" w:tplc="20000001">
+      <w:start w:val="1"/>
+      <w:numFmt w:val="bullet"/>
+      <w:lvlText w:val=""/>
+      <w:lvlJc w:val="left"/>
+      <w:pPr>
+        <w:ind w:left="720" w:hanging="360"/>
+      </w:pPr>
+      <w:rPr>
+        <w:rFonts w:ascii="Symbol" w:hAnsi="Symbol" w:hint="default"/>
+      </w:rPr>
+    </w:lvl>
+    <w:lvl w:ilvl="1" w:tplc="20000003" w:tentative="1">
+      <w:start w:val="1"/>
+      <w:numFmt w:val="bullet"/>
+      <w:lvlText w:val="o"/>
+      <w:lvlJc w:val="left"/>
+      <w:pPr>
+        <w:ind w:left="1440" w:hanging="360"/>
+      </w:pPr>
+      <w:rPr>
+        <w:rFonts w:ascii="Courier New" w:hAnsi="Courier New" w:cs="Courier New" w:hint="default"/>
+      </w:rPr>
+    </w:lvl>
+    <w:lvl w:ilvl="2" w:tplc="20000005" w:tentative="1">
+      <w:start w:val="1"/>
+      <w:numFmt w:val="bullet"/>
+      <w:lvlText w:val=""/>
+      <w:lvlJc w:val="left"/>
+      <w:pPr>
+        <w:ind w:left="2160" w:hanging="360"/>
+      </w:pPr>
+      <w:rPr>
+        <w:rFonts w:ascii="Wingdings" w:hAnsi="Wingdings" w:hint="default"/>
+      </w:rPr>
+    </w:lvl>
+    <w:lvl w:ilvl="3" w:tplc="20000001" w:tentative="1">
+      <w:start w:val="1"/>
+      <w:numFmt w:val="bullet"/>
+      <w:lvlText w:val=""/>
+      <w:lvlJc w:val="left"/>
+      <w:pPr>
+        <w:ind w:left="2880" w:hanging="360"/>
+      </w:pPr>
+      <w:rPr>
+        <w:rFonts w:ascii="Symbol" w:hAnsi="Symbol" w:hint="default"/>
+      </w:rPr>
+    </w:lvl>
+    <w:lvl w:ilvl="4" w:tplc="20000003" w:tentative="1">
+      <w:start w:val="1"/>
+      <w:numFmt w:val="bullet"/>
+      <w:lvlText w:val="o"/>
+      <w:lvlJc w:val="left"/>
+      <w:pPr>
+        <w:ind w:left="3600" w:hanging="360"/>
+      </w:pPr>
+      <w:rPr>
+        <w:rFonts w:ascii="Courier New" w:hAnsi="Courier New" w:cs="Courier New" w:hint="default"/>
+      </w:rPr>
+    </w:lvl>
+    <w:lvl w:ilvl="5" w:tplc="20000005" w:tentative="1">
+      <w:start w:val="1"/>
+      <w:numFmt w:val="bullet"/>
+      <w:lvlText w:val=""/>
+      <w:lvlJc w:val="left"/>
+      <w:pPr>
+        <w:ind w:left="4320" w:hanging="360"/>
+      </w:pPr>
+      <w:rPr>
+        <w:rFonts w:ascii="Wingdings" w:hAnsi="Wingdings" w:hint="default"/>
+      </w:rPr>
+    </w:lvl>
+    <w:lvl w:ilvl="6" w:tplc="20000001" w:tentative="1">
+      <w:start w:val="1"/>
+      <w:numFmt w:val="bullet"/>
+      <w:lvlText w:val=""/>
+      <w:lvlJc w:val="left"/>
+      <w:pPr>
+        <w:ind w:left="5040" w:hanging="360"/>
+      </w:pPr>
+      <w:rPr>
+        <w:rFonts w:ascii="Symbol" w:hAnsi="Symbol" w:hint="default"/>
+      </w:rPr>
+    </w:lvl>
+    <w:lvl w:ilvl="7" w:tplc="20000003" w:tentative="1">
+      <w:start w:val="1"/>
+      <w:numFmt w:val="bullet"/>
+      <w:lvlText w:val="o"/>
+      <w:lvlJc w:val="left"/>
+      <w:pPr>
+        <w:ind w:left="5760" w:hanging="360"/>
+      </w:pPr>
+      <w:rPr>
+        <w:rFonts w:ascii="Courier New" w:hAnsi="Courier New" w:cs="Courier New" w:hint="default"/>
+      </w:rPr>
+    </w:lvl>
+    <w:lvl w:ilvl="8" w:tplc="20000005" w:tentative="1">
+      <w:start w:val="1"/>
+      <w:numFmt w:val="bullet"/>
+      <w:lvlText w:val=""/>
+      <w:lvlJc w:val="left"/>
+      <w:pPr>
+        <w:ind w:left="6480" w:hanging="360"/>
+      </w:pPr>
+      <w:rPr>
+        <w:rFonts w:ascii="Wingdings" w:hAnsi="Wingdings" w:hint="default"/>
+      </w:rPr>
+    </w:lvl>
+  </w:abstractNum>
+  <w:abstractNum w:abstractNumId="10" w15:restartNumberingAfterBreak="0">
     <w:nsid w:val="43990A80"/>
     <w:multiLevelType w:val="multilevel"/>
     <w:tmpl w:val="05F4BD0A"/>
@@ -5990,7 +6119,7 @@
       </w:rPr>
     </w:lvl>
   </w:abstractNum>
-  <w:abstractNum w:abstractNumId="10" w15:restartNumberingAfterBreak="0">
+  <w:abstractNum w:abstractNumId="11" w15:restartNumberingAfterBreak="0">
     <w:nsid w:val="4E776023"/>
     <w:multiLevelType w:val="multilevel"/>
     <w:tmpl w:val="B0E6E058"/>
@@ -6139,7 +6268,7 @@
       </w:rPr>
     </w:lvl>
   </w:abstractNum>
-  <w:abstractNum w:abstractNumId="11" w15:restartNumberingAfterBreak="0">
+  <w:abstractNum w:abstractNumId="12" w15:restartNumberingAfterBreak="0">
     <w:nsid w:val="4EA725AA"/>
     <w:multiLevelType w:val="multilevel"/>
     <w:tmpl w:val="2938B274"/>
@@ -6288,7 +6417,7 @@
       </w:rPr>
     </w:lvl>
   </w:abstractNum>
-  <w:abstractNum w:abstractNumId="12" w15:restartNumberingAfterBreak="0">
+  <w:abstractNum w:abstractNumId="13" w15:restartNumberingAfterBreak="0">
     <w:nsid w:val="52AC6855"/>
     <w:multiLevelType w:val="multilevel"/>
     <w:tmpl w:val="C408E002"/>
@@ -6437,7 +6566,7 @@
       </w:rPr>
     </w:lvl>
   </w:abstractNum>
-  <w:abstractNum w:abstractNumId="13" w15:restartNumberingAfterBreak="0">
+  <w:abstractNum w:abstractNumId="14" w15:restartNumberingAfterBreak="0">
     <w:nsid w:val="52E96D5E"/>
     <w:multiLevelType w:val="multilevel"/>
     <w:tmpl w:val="223248C4"/>
@@ -6586,7 +6715,7 @@
       </w:rPr>
     </w:lvl>
   </w:abstractNum>
-  <w:abstractNum w:abstractNumId="14" w15:restartNumberingAfterBreak="0">
+  <w:abstractNum w:abstractNumId="15" w15:restartNumberingAfterBreak="0">
     <w:nsid w:val="58661A4F"/>
     <w:multiLevelType w:val="multilevel"/>
     <w:tmpl w:val="1E32CD22"/>
@@ -6735,7 +6864,7 @@
       </w:rPr>
     </w:lvl>
   </w:abstractNum>
-  <w:abstractNum w:abstractNumId="15" w15:restartNumberingAfterBreak="0">
+  <w:abstractNum w:abstractNumId="16" w15:restartNumberingAfterBreak="0">
     <w:nsid w:val="5AF81EF9"/>
     <w:multiLevelType w:val="multilevel"/>
     <w:tmpl w:val="28F81410"/>
@@ -6848,7 +6977,7 @@
       </w:pPr>
     </w:lvl>
   </w:abstractNum>
-  <w:abstractNum w:abstractNumId="16" w15:restartNumberingAfterBreak="0">
+  <w:abstractNum w:abstractNumId="17" w15:restartNumberingAfterBreak="0">
     <w:nsid w:val="5D787E35"/>
     <w:multiLevelType w:val="multilevel"/>
     <w:tmpl w:val="05340BBA"/>
@@ -6997,7 +7126,7 @@
       </w:rPr>
     </w:lvl>
   </w:abstractNum>
-  <w:abstractNum w:abstractNumId="17" w15:restartNumberingAfterBreak="0">
+  <w:abstractNum w:abstractNumId="18" w15:restartNumberingAfterBreak="0">
     <w:nsid w:val="5E8F6372"/>
     <w:multiLevelType w:val="multilevel"/>
     <w:tmpl w:val="8FF2AB50"/>
@@ -7146,7 +7275,7 @@
       </w:rPr>
     </w:lvl>
   </w:abstractNum>
-  <w:abstractNum w:abstractNumId="18" w15:restartNumberingAfterBreak="0">
+  <w:abstractNum w:abstractNumId="19" w15:restartNumberingAfterBreak="0">
     <w:nsid w:val="662319B4"/>
     <w:multiLevelType w:val="multilevel"/>
     <w:tmpl w:val="AB265D72"/>
@@ -7295,7 +7424,7 @@
       </w:rPr>
     </w:lvl>
   </w:abstractNum>
-  <w:abstractNum w:abstractNumId="19" w15:restartNumberingAfterBreak="0">
+  <w:abstractNum w:abstractNumId="20" w15:restartNumberingAfterBreak="0">
     <w:nsid w:val="6F7B0011"/>
     <w:multiLevelType w:val="multilevel"/>
     <w:tmpl w:val="6950C21E"/>
@@ -7444,7 +7573,7 @@
       </w:rPr>
     </w:lvl>
   </w:abstractNum>
-  <w:abstractNum w:abstractNumId="20" w15:restartNumberingAfterBreak="0">
+  <w:abstractNum w:abstractNumId="21" w15:restartNumberingAfterBreak="0">
     <w:nsid w:val="70C45852"/>
     <w:multiLevelType w:val="multilevel"/>
     <w:tmpl w:val="0812DEFA"/>
@@ -7593,7 +7722,7 @@
       </w:rPr>
     </w:lvl>
   </w:abstractNum>
-  <w:abstractNum w:abstractNumId="21" w15:restartNumberingAfterBreak="0">
+  <w:abstractNum w:abstractNumId="22" w15:restartNumberingAfterBreak="0">
     <w:nsid w:val="72172117"/>
     <w:multiLevelType w:val="multilevel"/>
     <w:tmpl w:val="60B20A86"/>
@@ -7742,7 +7871,7 @@
       </w:rPr>
     </w:lvl>
   </w:abstractNum>
-  <w:abstractNum w:abstractNumId="22" w15:restartNumberingAfterBreak="0">
+  <w:abstractNum w:abstractNumId="23" w15:restartNumberingAfterBreak="0">
     <w:nsid w:val="73BD64CB"/>
     <w:multiLevelType w:val="multilevel"/>
     <w:tmpl w:val="34BEAE10"/>
@@ -7891,7 +8020,7 @@
       </w:rPr>
     </w:lvl>
   </w:abstractNum>
-  <w:abstractNum w:abstractNumId="23" w15:restartNumberingAfterBreak="0">
+  <w:abstractNum w:abstractNumId="24" w15:restartNumberingAfterBreak="0">
     <w:nsid w:val="74634B43"/>
     <w:multiLevelType w:val="multilevel"/>
     <w:tmpl w:val="3034B53C"/>
@@ -8040,7 +8169,7 @@
       </w:rPr>
     </w:lvl>
   </w:abstractNum>
-  <w:abstractNum w:abstractNumId="24" w15:restartNumberingAfterBreak="0">
+  <w:abstractNum w:abstractNumId="25" w15:restartNumberingAfterBreak="0">
     <w:nsid w:val="7C7F7496"/>
     <w:multiLevelType w:val="multilevel"/>
     <w:tmpl w:val="CC1E23AA"/>
@@ -8190,13 +8319,13 @@
     </w:lvl>
   </w:abstractNum>
   <w:num w:numId="1" w16cid:durableId="2093089857">
-    <w:abstractNumId w:val="15"/>
+    <w:abstractNumId w:val="16"/>
   </w:num>
   <w:num w:numId="2" w16cid:durableId="893470673">
-    <w:abstractNumId w:val="18"/>
+    <w:abstractNumId w:val="19"/>
   </w:num>
   <w:num w:numId="3" w16cid:durableId="1640576113">
-    <w:abstractNumId w:val="17"/>
+    <w:abstractNumId w:val="18"/>
   </w:num>
   <w:num w:numId="4" w16cid:durableId="286158644">
     <w:abstractNumId w:val="3"/>
@@ -8205,31 +8334,31 @@
     <w:abstractNumId w:val="0"/>
   </w:num>
   <w:num w:numId="6" w16cid:durableId="323709352">
-    <w:abstractNumId w:val="16"/>
+    <w:abstractNumId w:val="17"/>
   </w:num>
   <w:num w:numId="7" w16cid:durableId="52436952">
     <w:abstractNumId w:val="5"/>
   </w:num>
   <w:num w:numId="8" w16cid:durableId="699211663">
-    <w:abstractNumId w:val="12"/>
+    <w:abstractNumId w:val="13"/>
   </w:num>
   <w:num w:numId="9" w16cid:durableId="473911169">
-    <w:abstractNumId w:val="14"/>
+    <w:abstractNumId w:val="15"/>
   </w:num>
   <w:num w:numId="10" w16cid:durableId="153187950">
-    <w:abstractNumId w:val="13"/>
+    <w:abstractNumId w:val="14"/>
   </w:num>
   <w:num w:numId="11" w16cid:durableId="691959564">
     <w:abstractNumId w:val="6"/>
   </w:num>
   <w:num w:numId="12" w16cid:durableId="186215153">
-    <w:abstractNumId w:val="10"/>
+    <w:abstractNumId w:val="11"/>
   </w:num>
   <w:num w:numId="13" w16cid:durableId="1525241537">
-    <w:abstractNumId w:val="19"/>
+    <w:abstractNumId w:val="20"/>
   </w:num>
   <w:num w:numId="14" w16cid:durableId="535656086">
-    <w:abstractNumId w:val="22"/>
+    <w:abstractNumId w:val="23"/>
   </w:num>
   <w:num w:numId="15" w16cid:durableId="1620452435">
     <w:abstractNumId w:val="4"/>
@@ -8238,10 +8367,10 @@
     <w:abstractNumId w:val="8"/>
   </w:num>
   <w:num w:numId="17" w16cid:durableId="776683917">
-    <w:abstractNumId w:val="23"/>
+    <w:abstractNumId w:val="24"/>
   </w:num>
   <w:num w:numId="18" w16cid:durableId="100147328">
-    <w:abstractNumId w:val="21"/>
+    <w:abstractNumId w:val="22"/>
   </w:num>
   <w:num w:numId="19" w16cid:durableId="1810131075">
     <w:abstractNumId w:val="1"/>
@@ -8253,15 +8382,18 @@
     <w:abstractNumId w:val="2"/>
   </w:num>
   <w:num w:numId="22" w16cid:durableId="1629777996">
-    <w:abstractNumId w:val="11"/>
+    <w:abstractNumId w:val="12"/>
   </w:num>
   <w:num w:numId="23" w16cid:durableId="1437754374">
-    <w:abstractNumId w:val="20"/>
+    <w:abstractNumId w:val="21"/>
   </w:num>
   <w:num w:numId="24" w16cid:durableId="1062944910">
-    <w:abstractNumId w:val="24"/>
+    <w:abstractNumId w:val="25"/>
   </w:num>
   <w:num w:numId="25" w16cid:durableId="1827435949">
+    <w:abstractNumId w:val="10"/>
+  </w:num>
+  <w:num w:numId="26" w16cid:durableId="992948722">
     <w:abstractNumId w:val="9"/>
   </w:num>
 </w:numbering>
@@ -8890,6 +9022,17 @@
       <w:shd w:val="clear" w:color="auto" w:fill="E1DFDD"/>
     </w:rPr>
   </w:style>
+  <w:style w:type="paragraph" w:styleId="ListParagraph">
+    <w:name w:val="List Paragraph"/>
+    <w:basedOn w:val="Normal"/>
+    <w:uiPriority w:val="34"/>
+    <w:qFormat/>
+    <w:rsid w:val="00911B3E"/>
+    <w:pPr>
+      <w:ind w:left="720"/>
+      <w:contextualSpacing/>
+    </w:pPr>
+  </w:style>
 </w:styles>
 </file>
 

</xml_diff>